<commit_message>
Remove affiliation (author is unaffiliated); regenerate DOCX
Per author: no organizational association. Removed 'Independent researcher'
from manuscript and cover letter to match the submission system (No
affiliation). Regenerated PAPER.docx and COVER_LETTER.docx.

Co-Authored-By: Claude Opus 4.8 <noreply@anthropic.com>
</commit_message>
<xml_diff>
--- a/paper/submissions/journals/computational_brain_and_behavior/COVER_LETTER.docx
+++ b/paper/submissions/journals/computational_brain_and_behavior/COVER_LETTER.docx
@@ -17,12 +17,6 @@
       </w:pPr>
       <w:r>
         <w:t xml:space="preserve">Aayush Gandhi</w:t>
-      </w:r>
-      <w:r>
-        <w:t xml:space="preserve"> </w:t>
-      </w:r>
-      <w:r>
-        <w:t xml:space="preserve">Independent researcher</w:t>
       </w:r>
       <w:r>
         <w:t xml:space="preserve"> </w:t>

</xml_diff>